<commit_message>
docs: clarify subject competency responsibility
</commit_message>
<xml_diff>
--- a/docs/คู่มือการใช้งาน CRS MIS — ครูผู้สอน.docx
+++ b/docs/คู่มือการใช้งาน CRS MIS — ครูผู้สอน.docx
@@ -1448,6 +1448,73 @@
         </w:rPr>
         <w:t>บันทึก แล้วเปิดสรุปผลการเรียนเพื่อตรวจผลที่ระบบเทียบสัดส่วนให้อัตโนมัติ</w:t>
       </w:r>
+    </w:p>
+    <w:tbl>
+      <w:tblPr>
+        <w:tblW w:type="dxa" w:w="9360"/>
+        <w:jc w:val="left"/>
+        <w:tblLayout w:type="fixed"/>
+        <w:tblLook w:firstColumn="1" w:firstRow="1" w:lastColumn="0" w:lastRow="0" w:noHBand="0" w:noVBand="1" w:val="04A0"/>
+        <w:tblInd w:w="120" w:type="dxa"/>
+      </w:tblPr>
+      <w:tblGrid>
+        <w:gridCol w:w="9360"/>
+      </w:tblGrid>
+      <w:tr>
+        <w:tc>
+          <w:tcPr>
+            <w:tcW w:type="dxa" w:w="9360"/>
+            <w:tcMar>
+              <w:top w:w="80" w:type="dxa"/>
+              <w:start w:w="120" w:type="dxa"/>
+              <w:bottom w:w="80" w:type="dxa"/>
+              <w:end w:w="120" w:type="dxa"/>
+            </w:tcMar>
+            <w:vAlign w:val="center"/>
+            <w:shd w:fill="FFF6DE" w:val="clear"/>
+            <w:tcBorders>
+              <w:start w:val="single" w:sz="18" w:color="9A6700"/>
+              <w:top w:val="single" w:sz="4" w:color="FFF6DE"/>
+              <w:bottom w:val="single" w:sz="4" w:color="FFF6DE"/>
+              <w:end w:val="single" w:sz="4" w:color="FFF6DE"/>
+            </w:tcBorders>
+          </w:tcPr>
+          <w:p>
+            <w:pPr>
+              <w:spacing w:after="40"/>
+            </w:pPr>
+            <w:r>
+              <w:rPr>
+                <w:rFonts w:ascii="TH Sarabun New" w:hAnsi="TH Sarabun New" w:eastAsia="TH Sarabun New" w:cs="TH Sarabun New"/>
+                <w:b/>
+                <w:color w:val="9A6700"/>
+                <w:sz w:val="22"/>
+                <w:lang w:val="th-TH" w:eastAsia="th-TH" w:bidi="th-TH"/>
+              </w:rPr>
+              <w:t>หน้าที่ของครูเจ้าของวิชา</w:t>
+            </w:r>
+          </w:p>
+          <w:p>
+            <w:pPr>
+              <w:spacing w:after="0" w:line="288" w:lineRule="auto"/>
+            </w:pPr>
+            <w:r>
+              <w:rPr>
+                <w:rFonts w:ascii="TH Sarabun New" w:hAnsi="TH Sarabun New" w:eastAsia="TH Sarabun New" w:cs="TH Sarabun New"/>
+                <w:color w:val="17312A"/>
+                <w:sz w:val="21"/>
+                <w:lang w:val="th-TH" w:eastAsia="th-TH" w:bidi="th-TH"/>
+              </w:rPr>
+              <w:t>ครูเจ้าของวิชาต้องกรอกคะแนนสมรรถนะหลักของนักเรียนในวิชาที่รับผิดชอบด้วยตนเอง โดยเลือกประเภทคะแนน “สมรรถนะหลัก” และกรอกให้ครบตามโครงสร้างที่กำหนด การกรอกเฉพาะคะแนนวิชายังถือว่างานไม่ครบ</w:t>
+            </w:r>
+          </w:p>
+        </w:tc>
+      </w:tr>
+    </w:tbl>
+    <w:p>
+      <w:pPr>
+        <w:spacing w:after="20"/>
+      </w:pPr>
     </w:p>
     <w:p>
       <w:pPr>

</xml_diff>